<commit_message>
Compendium whitespace retune: 52 pages, dense throughout
Stale pre-keep-chain pagebreaks removed, Part IV sheets flow
continuously, closing image pair reseated, portrait sizes tuned.

Co-Authored-By: Claude Opus 4.8 <noreply@anthropic.com>
</commit_message>
<xml_diff>
--- a/compendium/character_sheets.docx
+++ b/compendium/character_sheets.docx
@@ -111,7 +111,6 @@
     <w:p>
       <w:pPr>
         <w:keepNext/>
-        <w:pageBreakBefore/>
         <w:spacing w:before="400" w:after="120"/>
         <w:pBdr>
           <w:bottom w:val="single" w:sz="6" w:space="4" w:color="B8860B"/>
@@ -2112,7 +2111,6 @@
     <w:p>
       <w:pPr>
         <w:keepNext/>
-        <w:pageBreakBefore/>
         <w:spacing w:before="400" w:after="120"/>
         <w:pBdr>
           <w:bottom w:val="single" w:sz="6" w:space="4" w:color="B8860B"/>
@@ -2142,7 +2140,7 @@
             <wp:positionV relativeFrom="paragraph">
               <wp:posOffset>0</wp:posOffset>
             </wp:positionV>
-            <wp:extent cx="2651760" cy="2651760"/>
+            <wp:extent cx="2103120" cy="2103120"/>
             <wp:effectExtent l="0" t="0" r="0" b="0"/>
             <wp:wrapSquare wrapText="bothSides"/>
             <wp:docPr id="2" name="Picture 2"/>
@@ -2163,7 +2161,7 @@
                   <pic:spPr>
                     <a:xfrm>
                       <a:off x="0" y="0"/>
-                      <a:ext cx="2651760" cy="2651760"/>
+                      <a:ext cx="2103120" cy="2103120"/>
                     </a:xfrm>
                     <a:prstGeom prst="rect"/>
                   </pic:spPr>
@@ -3520,7 +3518,6 @@
     <w:p>
       <w:pPr>
         <w:keepNext/>
-        <w:pageBreakBefore/>
         <w:spacing w:before="400" w:after="120"/>
         <w:pBdr>
           <w:bottom w:val="single" w:sz="6" w:space="4" w:color="B8860B"/>
@@ -3550,7 +3547,7 @@
             <wp:positionV relativeFrom="paragraph">
               <wp:posOffset>0</wp:posOffset>
             </wp:positionV>
-            <wp:extent cx="2651760" cy="2651760"/>
+            <wp:extent cx="2286000" cy="2286000"/>
             <wp:effectExtent l="0" t="0" r="0" b="0"/>
             <wp:wrapSquare wrapText="bothSides"/>
             <wp:docPr id="3" name="Picture 3"/>
@@ -3571,7 +3568,7 @@
                   <pic:spPr>
                     <a:xfrm>
                       <a:off x="0" y="0"/>
-                      <a:ext cx="2651760" cy="2651760"/>
+                      <a:ext cx="2286000" cy="2286000"/>
                     </a:xfrm>
                     <a:prstGeom prst="rect"/>
                   </pic:spPr>
@@ -5704,7 +5701,6 @@
     <w:p>
       <w:pPr>
         <w:keepNext/>
-        <w:pageBreakBefore/>
         <w:spacing w:before="400" w:after="120"/>
         <w:pBdr>
           <w:bottom w:val="single" w:sz="6" w:space="4" w:color="B8860B"/>
@@ -5738,6 +5734,7 @@
     <w:p>
       <w:pPr>
         <w:keepNext/>
+        <w:keepLines/>
         <w:pBdr>
           <w:left w:val="single" w:sz="18" w:space="12" w:color="8B2020"/>
         </w:pBdr>
@@ -5755,7 +5752,7 @@
             <wp:positionV relativeFrom="paragraph">
               <wp:posOffset>0</wp:posOffset>
             </wp:positionV>
-            <wp:extent cx="1584960" cy="2377440"/>
+            <wp:extent cx="1463040" cy="2194560"/>
             <wp:effectExtent l="0" t="0" r="0" b="0"/>
             <wp:wrapSquare wrapText="bothSides"/>
             <wp:docPr id="4" name="Picture 4"/>
@@ -5776,7 +5773,7 @@
                   <pic:spPr>
                     <a:xfrm>
                       <a:off x="0" y="0"/>
-                      <a:ext cx="1584960" cy="2377440"/>
+                      <a:ext cx="1463040" cy="2194560"/>
                     </a:xfrm>
                     <a:prstGeom prst="rect"/>
                   </pic:spPr>
@@ -5798,6 +5795,8 @@
     </w:p>
     <w:p>
       <w:pPr>
+        <w:keepNext/>
+        <w:keepLines/>
         <w:pBdr>
           <w:left w:val="single" w:sz="18" w:space="12" w:color="8B2020"/>
         </w:pBdr>
@@ -5817,6 +5816,8 @@
     </w:p>
     <w:p>
       <w:pPr>
+        <w:keepNext/>
+        <w:keepLines/>
         <w:pBdr>
           <w:left w:val="single" w:sz="18" w:space="12" w:color="8B2020"/>
           <w:bottom w:val="single" w:sz="4" w:space="1" w:color="8B2020"/>
@@ -5828,6 +5829,8 @@
     </w:p>
     <w:p>
       <w:pPr>
+        <w:keepNext/>
+        <w:keepLines/>
         <w:pBdr>
           <w:left w:val="single" w:sz="18" w:space="12" w:color="8B2020"/>
         </w:pBdr>
@@ -5857,6 +5860,8 @@
     </w:p>
     <w:p>
       <w:pPr>
+        <w:keepNext/>
+        <w:keepLines/>
         <w:pBdr>
           <w:left w:val="single" w:sz="18" w:space="12" w:color="8B2020"/>
         </w:pBdr>
@@ -5886,6 +5891,8 @@
     </w:p>
     <w:p>
       <w:pPr>
+        <w:keepNext/>
+        <w:keepLines/>
         <w:pBdr>
           <w:left w:val="single" w:sz="18" w:space="12" w:color="8B2020"/>
         </w:pBdr>
@@ -5915,6 +5922,8 @@
     </w:p>
     <w:p>
       <w:pPr>
+        <w:keepNext/>
+        <w:keepLines/>
         <w:pBdr>
           <w:left w:val="single" w:sz="18" w:space="12" w:color="8B2020"/>
           <w:bottom w:val="single" w:sz="4" w:space="1" w:color="8B2020"/>
@@ -5926,6 +5935,8 @@
     </w:p>
     <w:p>
       <w:pPr>
+        <w:keepNext/>
+        <w:keepLines/>
         <w:pBdr>
           <w:left w:val="single" w:sz="18" w:space="12" w:color="8B2020"/>
         </w:pBdr>

</xml_diff>

<commit_message>
Cut Dread Shroud from every version of Ghostbloom
It duplicated the Frightened condition her Spectral Lash rider already
imposes twice a round, and it did so at will, on a bonus action, with no
concentration and no use limit. She keeps a full kit without it: two
lashes at 15 ft with a fear save each, Guardian's Light, the Ghostly
Wail, Fey Step and Spectral Form. Removed from her level-7 card, her
original card, and her companion sheet (DM call).

Co-Authored-By: Claude Opus 4.8 <noreply@anthropic.com>
</commit_message>
<xml_diff>
--- a/compendium/character_sheets.docx
+++ b/compendium/character_sheets.docx
@@ -6510,46 +6510,6 @@
           <w:sz w:val="18"/>
         </w:rPr>
         <w:t>A haunting cry in a 15-foot cone. Each creature in that area must succeed on a DC 15 Wisdom saving throw, taking 4d6 necrotic damage on a failed save, or half as much on a success. On a failed save, the target is frightened until the end of its next turn.</w:t>
-      </w:r>
-    </w:p>
-    <w:p>
-      <w:pPr>
-        <w:pBdr>
-          <w:left w:val="single" w:sz="18" w:space="12" w:color="8B2020"/>
-        </w:pBdr>
-        <w:shd w:val="clear" w:color="auto" w:fill="FCF6F6"/>
-        <w:spacing w:before="30" w:after="20"/>
-        <w:ind w:left="340" w:right="340"/>
-      </w:pPr>
-      <w:r>
-        <w:rPr>
-          <w:rFonts w:ascii="Georgia" w:hAnsi="Georgia" w:cs="Georgia"/>
-          <w:b/>
-          <w:i/>
-          <w:color w:val="222222"/>
-          <w:sz w:val="18"/>
-        </w:rPr>
-        <w:t xml:space="preserve">Dread Shroud. </w:t>
-      </w:r>
-      <w:r>
-        <w:rPr>
-          <w:rFonts w:ascii="Georgia" w:hAnsi="Georgia" w:cs="Georgia"/>
-          <w:b w:val="0"/>
-          <w:i/>
-          <w:color w:val="222222"/>
-          <w:sz w:val="18"/>
-        </w:rPr>
-        <w:t>Bonus Action; 30 ft.; one creature.</w:t>
-      </w:r>
-      <w:r>
-        <w:rPr>
-          <w:rFonts w:ascii="Georgia" w:hAnsi="Georgia" w:cs="Georgia"/>
-          <w:b w:val="0"/>
-          <w:i w:val="0"/>
-          <w:color w:val="222222"/>
-          <w:sz w:val="18"/>
-        </w:rPr>
-        <w:t xml:space="preserve"> A chill bloom settles over the target. It must succeed on a DC 15 Wisdom save or suffer disadvantage on all attack rolls until the start of your next turn.</w:t>
       </w:r>
     </w:p>
     <w:p>

</xml_diff>

<commit_message>
Fix Ursa's level-5 sheet: the +1 light aura is allies-only, not self
Applies the 2026-07-25 DM ruling to the Session 7 (level 5) sheet: Ursa's
own to-hit is +8, not the +8 (+9) the sheet showed on Guiding Bolt,
Star-Arrow, and Starry Wisp. Rewrote the parenthetical note, which had
said the Amulet buffs 'him and nearby friends', to state it is a party
buff for allies only. His own attacks stay +8.

Co-Authored-By: Claude Opus 4.8 <noreply@anthropic.com>
</commit_message>
<xml_diff>
--- a/compendium/character_sheets.docx
+++ b/compendium/character_sheets.docx
@@ -4295,7 +4295,7 @@
           <w:color w:val="222222"/>
           <w:sz w:val="18"/>
         </w:rPr>
-        <w:t xml:space="preserve"> +8 (+9) to hit, 120 ft: 4d6 radiant + 1d4 (Starseed); the next hit on that target has advantage.</w:t>
+        <w:t xml:space="preserve"> +8 to hit, 120 ft: 4d6 radiant + 1d4 (Starseed); the next hit on that target has advantage.</w:t>
       </w:r>
     </w:p>
     <w:p>
@@ -4325,7 +4325,7 @@
           <w:color w:val="222222"/>
           <w:sz w:val="18"/>
         </w:rPr>
-        <w:t xml:space="preserve"> Bonus action, +8 (+9) to hit: 1d8 + 5 radiant, one enemy within 60 ft.</w:t>
+        <w:t xml:space="preserve"> Bonus action, +8 to hit: 1d8 + 5 radiant, one enemy within 60 ft.</w:t>
       </w:r>
     </w:p>
     <w:p>
@@ -4355,7 +4355,7 @@
           <w:color w:val="222222"/>
           <w:sz w:val="18"/>
         </w:rPr>
-        <w:t xml:space="preserve"> +8 (+9) to hit, 60 ft: 2d8 radiant + 1d4 (Starseed); lights up the target.</w:t>
+        <w:t xml:space="preserve"> +8 to hit, 60 ft: 2d8 radiant + 1d4 (Starseed); lights up the target.</w:t>
       </w:r>
     </w:p>
     <w:p>
@@ -4375,7 +4375,7 @@
           <w:color w:val="222222"/>
           <w:sz w:val="18"/>
         </w:rPr>
-        <w:t>The number in (parentheses) is his to-hit while his Starry Form is glowing: the Amulet of Guiding Light gives +1 to attacks (and saves) for him and nearby friends. He keeps it on, so that's usually his real number.</w:t>
+        <w:t>While his Starry Form glows, the Amulet of Guiding Light gives +1 to attacks and saves to his nearby FRIENDS (allies only, not Ursa himself, DM ruling): it is a party buff, so his own to-hit stays +8.</w:t>
       </w:r>
     </w:p>
     <w:p>

</xml_diff>

<commit_message>
Ursa Star Map: 5 free Guiding Bolts/day (2024 RAW = Wis mod), not 3
DM approved bumping the Star Map's free Guiding Bolt count to 5 to match
2024 Circle of the Stars RAW (Wisdom modifier per long rest; Ursa's Wis is
20, +5), replacing the sheet's stale 3. Updated in all five places on the
level-5 sheet; the 'about 8 free bolts a day' math becomes 'about 10'.

Co-Authored-By: Claude Opus 4.8 <noreply@anthropic.com>
</commit_message>
<xml_diff>
--- a/compendium/character_sheets.docx
+++ b/compendium/character_sheets.docx
@@ -4455,7 +4455,7 @@
           <w:color w:val="222222"/>
           <w:sz w:val="22"/>
         </w:rPr>
-        <w:t xml:space="preserve"> Before touching his real spell slots, he can throw about 8 Guiding Bolts a day for free: 3 from the Star Map (per long rest) plus up to 5 from the Staff's charges. </w:t>
+        <w:t xml:space="preserve"> Before touching his real spell slots, he can throw about 10 Guiding Bolts a day for free: 5 from the Star Map (per long rest) plus up to 5 from the Staff's charges. </w:t>
       </w:r>
       <w:r>
         <w:rPr>
@@ -4690,7 +4690,7 @@
           <w:color w:val="222222"/>
           <w:sz w:val="18"/>
         </w:rPr>
-        <w:t xml:space="preserve"> His star chart is a magic focus. Free Guiding Bolt 3/day even without the Staff. Backup focus he still carries.</w:t>
+        <w:t xml:space="preserve"> His star chart is a magic focus. Free Guiding Bolt 5/day even without the Staff. Backup focus he still carries.</w:t>
       </w:r>
     </w:p>
     <w:p>
@@ -4985,7 +4985,7 @@
           <w:color w:val="222222"/>
           <w:sz w:val="18"/>
         </w:rPr>
-        <w:t xml:space="preserve"> A Tiny star chart that doubles as a spellcasting focus. Free Guiding Bolt 3/day. (Backup focus.)</w:t>
+        <w:t xml:space="preserve"> A Tiny star chart that doubles as a spellcasting focus. Free Guiding Bolt 5/day. (Backup focus.)</w:t>
       </w:r>
     </w:p>
     <w:p>
@@ -5325,7 +5325,7 @@
           <w:color w:val="222222"/>
           <w:sz w:val="18"/>
         </w:rPr>
-        <w:t xml:space="preserve"> Action, 120 ft (Star Map: free 3/day). Ranged spell attack +8: 4d6 radiant + 1d4 (Starseed), and the next attack against that target before Ursa's next turn has advantage.</w:t>
+        <w:t xml:space="preserve"> Action, 120 ft (Star Map: free 5/day). Ranged spell attack +8: 4d6 radiant + 1d4 (Starseed), and the next attack against that target before Ursa's next turn has advantage.</w:t>
       </w:r>
     </w:p>
     <w:p>

</xml_diff>

<commit_message>
Add 'Spells at a Glance' tracker to Lilly's and Ursa's sheets; finish aura cleanup
Fills the whitespace on Lilly's cannon page and Ursa's spirits page with a
compact play aid: a new 'spellref' block (book_style.py) renders a check-off
slot tracker (open boxes per level) beside the spell names known at each
level. It complements the existing slot pips (glance the count) and the full
spellbook (rules); this is the mid-fight tracker plus index. Both pages now
render ~95% full instead of half-empty.

Also finished the allies-only aura cleanup that the preview caught: three
more self-aura '+N (+M)' spots on Ursa's sheet (unlit staff +3, ignited
staff +9, spellbook Shillelagh +9) that the earlier commit missed. His own
to-hit is +8/+9 with no self-aura; the parenthetical +1s are gone.

Co-Authored-By: Claude Opus 4.8 <noreply@anthropic.com>
</commit_message>
<xml_diff>
--- a/compendium/character_sheets.docx
+++ b/compendium/character_sheets.docx
@@ -1171,6 +1171,146 @@
     <w:p>
       <w:pPr>
         <w:keepNext/>
+        <w:pBdr>
+          <w:left w:val="single" w:sz="18" w:space="12" w:color="1F6FB8"/>
+        </w:pBdr>
+        <w:shd w:val="clear" w:color="auto" w:fill="FBF6EA"/>
+        <w:spacing w:before="120" w:after="40"/>
+        <w:ind w:left="340" w:right="340"/>
+      </w:pPr>
+      <w:r>
+        <w:rPr>
+          <w:rFonts w:ascii="Georgia" w:hAnsi="Georgia" w:cs="Georgia"/>
+          <w:b/>
+          <w:color w:val="1F6FB8"/>
+          <w:sz w:val="25"/>
+        </w:rPr>
+        <w:t>Spells at a Glance</w:t>
+      </w:r>
+      <w:r>
+        <w:rPr>
+          <w:rFonts w:ascii="Georgia" w:hAnsi="Georgia" w:cs="Georgia"/>
+          <w:i/>
+          <w:color w:val="222222"/>
+          <w:sz w:val="18"/>
+        </w:rPr>
+        <w:t xml:space="preserve">   ☐ = one slot; check it off when it is spent.</w:t>
+      </w:r>
+    </w:p>
+    <w:p>
+      <w:pPr>
+        <w:keepNext/>
+        <w:pBdr>
+          <w:left w:val="single" w:sz="18" w:space="12" w:color="1F6FB8"/>
+        </w:pBdr>
+        <w:shd w:val="clear" w:color="auto" w:fill="FBF6EA"/>
+        <w:spacing w:before="0" w:after="40"/>
+        <w:ind w:left="340" w:right="340"/>
+      </w:pPr>
+      <w:r>
+        <w:rPr>
+          <w:rFonts w:ascii="Georgia" w:hAnsi="Georgia" w:cs="Georgia"/>
+          <w:b/>
+          <w:color w:val="1F6FB8"/>
+          <w:sz w:val="22"/>
+        </w:rPr>
+        <w:t xml:space="preserve">Cantrips  </w:t>
+      </w:r>
+      <w:r>
+        <w:rPr>
+          <w:rFonts w:ascii="Georgia" w:hAnsi="Georgia" w:cs="Georgia"/>
+          <w:i/>
+          <w:color w:val="222222"/>
+          <w:sz w:val="19"/>
+        </w:rPr>
+        <w:t>at will</w:t>
+      </w:r>
+      <w:r>
+        <w:rPr>
+          <w:rFonts w:ascii="Georgia" w:hAnsi="Georgia" w:cs="Georgia"/>
+          <w:color w:val="222222"/>
+          <w:sz w:val="20"/>
+        </w:rPr>
+        <w:t xml:space="preserve">   True Strike, Fire Bolt, Mending</w:t>
+      </w:r>
+    </w:p>
+    <w:p>
+      <w:pPr>
+        <w:keepNext/>
+        <w:pBdr>
+          <w:left w:val="single" w:sz="18" w:space="12" w:color="1F6FB8"/>
+        </w:pBdr>
+        <w:shd w:val="clear" w:color="auto" w:fill="FBF6EA"/>
+        <w:spacing w:before="0" w:after="40"/>
+        <w:ind w:left="340" w:right="340"/>
+      </w:pPr>
+      <w:r>
+        <w:rPr>
+          <w:rFonts w:ascii="Georgia" w:hAnsi="Georgia" w:cs="Georgia"/>
+          <w:b/>
+          <w:color w:val="1F6FB8"/>
+          <w:sz w:val="22"/>
+        </w:rPr>
+        <w:t xml:space="preserve">1st  </w:t>
+      </w:r>
+      <w:r>
+        <w:rPr>
+          <w:rFonts w:ascii="Georgia" w:hAnsi="Georgia" w:cs="Georgia"/>
+          <w:b/>
+          <w:color w:val="1F6FB8"/>
+          <w:sz w:val="25"/>
+        </w:rPr>
+        <w:t xml:space="preserve">☐ ☐ ☐ ☐ </w:t>
+      </w:r>
+      <w:r>
+        <w:rPr>
+          <w:rFonts w:ascii="Georgia" w:hAnsi="Georgia" w:cs="Georgia"/>
+          <w:color w:val="222222"/>
+          <w:sz w:val="20"/>
+        </w:rPr>
+        <w:t xml:space="preserve">   Shield, Thunderwave, Absorb Elements, Catapult, Snare, Faerie Fire, Tasha's Caustic Brew</w:t>
+      </w:r>
+    </w:p>
+    <w:p>
+      <w:pPr>
+        <w:keepNext w:val="0"/>
+        <w:pBdr>
+          <w:left w:val="single" w:sz="18" w:space="12" w:color="1F6FB8"/>
+        </w:pBdr>
+        <w:shd w:val="clear" w:color="auto" w:fill="FBF6EA"/>
+        <w:spacing w:before="0" w:after="160"/>
+        <w:ind w:left="340" w:right="340"/>
+      </w:pPr>
+      <w:r>
+        <w:rPr>
+          <w:rFonts w:ascii="Georgia" w:hAnsi="Georgia" w:cs="Georgia"/>
+          <w:b/>
+          <w:color w:val="1F6FB8"/>
+          <w:sz w:val="22"/>
+        </w:rPr>
+        <w:t xml:space="preserve">2nd  </w:t>
+      </w:r>
+      <w:r>
+        <w:rPr>
+          <w:rFonts w:ascii="Georgia" w:hAnsi="Georgia" w:cs="Georgia"/>
+          <w:b/>
+          <w:color w:val="1F6FB8"/>
+          <w:sz w:val="25"/>
+        </w:rPr>
+        <w:t xml:space="preserve">☐ ☐ </w:t>
+      </w:r>
+      <w:r>
+        <w:rPr>
+          <w:rFonts w:ascii="Georgia" w:hAnsi="Georgia" w:cs="Georgia"/>
+          <w:color w:val="222222"/>
+          <w:sz w:val="20"/>
+        </w:rPr>
+        <w:t xml:space="preserve">   Scorching Ray, Shatter, Heat Metal, Web</w:t>
+      </w:r>
+    </w:p>
+    <w:p>
+      <w:pPr>
+        <w:keepNext/>
         <w:spacing w:before="220" w:after="60"/>
       </w:pPr>
       <w:r>
@@ -4235,7 +4375,7 @@
           <w:color w:val="222222"/>
           <w:sz w:val="18"/>
         </w:rPr>
-        <w:t xml:space="preserve"> Melee, +3 (+4) to hit: 1d6 bludgeoning (1d8 two-handed). See Shillelagh!</w:t>
+        <w:t xml:space="preserve"> Melee, +3 to hit: 1d6 bludgeoning (1d8 two-handed). See Shillelagh!</w:t>
       </w:r>
     </w:p>
     <w:p>
@@ -4265,7 +4405,7 @@
           <w:color w:val="222222"/>
           <w:sz w:val="18"/>
         </w:rPr>
-        <w:t xml:space="preserve"> Melee, +9 (+10) to hit: 1d10 + 6 force or bludgeoning. Bonus action to light, lasts 1 minute.</w:t>
+        <w:t xml:space="preserve"> Melee, +9 to hit: 1d10 + 6 force or bludgeoning. Bonus action to light, lasts 1 minute.</w:t>
       </w:r>
     </w:p>
     <w:p>
@@ -4896,6 +5036,183 @@
     <w:p>
       <w:pPr>
         <w:keepNext/>
+        <w:pBdr>
+          <w:left w:val="single" w:sz="18" w:space="12" w:color="5B2A86"/>
+        </w:pBdr>
+        <w:shd w:val="clear" w:color="auto" w:fill="FBF6EA"/>
+        <w:spacing w:before="120" w:after="40"/>
+        <w:ind w:left="340" w:right="340"/>
+      </w:pPr>
+      <w:r>
+        <w:rPr>
+          <w:rFonts w:ascii="Georgia" w:hAnsi="Georgia" w:cs="Georgia"/>
+          <w:b/>
+          <w:color w:val="5B2A86"/>
+          <w:sz w:val="25"/>
+        </w:rPr>
+        <w:t>Spells at a Glance</w:t>
+      </w:r>
+      <w:r>
+        <w:rPr>
+          <w:rFonts w:ascii="Georgia" w:hAnsi="Georgia" w:cs="Georgia"/>
+          <w:i/>
+          <w:color w:val="222222"/>
+          <w:sz w:val="18"/>
+        </w:rPr>
+        <w:t xml:space="preserve">   ☐ = one slot; check it off when it is spent.</w:t>
+      </w:r>
+    </w:p>
+    <w:p>
+      <w:pPr>
+        <w:keepNext/>
+        <w:pBdr>
+          <w:left w:val="single" w:sz="18" w:space="12" w:color="5B2A86"/>
+        </w:pBdr>
+        <w:shd w:val="clear" w:color="auto" w:fill="FBF6EA"/>
+        <w:spacing w:before="0" w:after="40"/>
+        <w:ind w:left="340" w:right="340"/>
+      </w:pPr>
+      <w:r>
+        <w:rPr>
+          <w:rFonts w:ascii="Georgia" w:hAnsi="Georgia" w:cs="Georgia"/>
+          <w:b/>
+          <w:color w:val="5B2A86"/>
+          <w:sz w:val="22"/>
+        </w:rPr>
+        <w:t xml:space="preserve">Cantrips  </w:t>
+      </w:r>
+      <w:r>
+        <w:rPr>
+          <w:rFonts w:ascii="Georgia" w:hAnsi="Georgia" w:cs="Georgia"/>
+          <w:i/>
+          <w:color w:val="222222"/>
+          <w:sz w:val="19"/>
+        </w:rPr>
+        <w:t>at will</w:t>
+      </w:r>
+      <w:r>
+        <w:rPr>
+          <w:rFonts w:ascii="Georgia" w:hAnsi="Georgia" w:cs="Georgia"/>
+          <w:color w:val="222222"/>
+          <w:sz w:val="20"/>
+        </w:rPr>
+        <w:t xml:space="preserve">   Shillelagh, Starry Wisp, Guidance, Druidcraft</w:t>
+      </w:r>
+    </w:p>
+    <w:p>
+      <w:pPr>
+        <w:keepNext/>
+        <w:pBdr>
+          <w:left w:val="single" w:sz="18" w:space="12" w:color="5B2A86"/>
+        </w:pBdr>
+        <w:shd w:val="clear" w:color="auto" w:fill="FBF6EA"/>
+        <w:spacing w:before="0" w:after="40"/>
+        <w:ind w:left="340" w:right="340"/>
+      </w:pPr>
+      <w:r>
+        <w:rPr>
+          <w:rFonts w:ascii="Georgia" w:hAnsi="Georgia" w:cs="Georgia"/>
+          <w:b/>
+          <w:color w:val="5B2A86"/>
+          <w:sz w:val="22"/>
+        </w:rPr>
+        <w:t xml:space="preserve">1st  </w:t>
+      </w:r>
+      <w:r>
+        <w:rPr>
+          <w:rFonts w:ascii="Georgia" w:hAnsi="Georgia" w:cs="Georgia"/>
+          <w:b/>
+          <w:color w:val="5B2A86"/>
+          <w:sz w:val="25"/>
+        </w:rPr>
+        <w:t xml:space="preserve">☐ ☐ ☐ ☐ </w:t>
+      </w:r>
+      <w:r>
+        <w:rPr>
+          <w:rFonts w:ascii="Georgia" w:hAnsi="Georgia" w:cs="Georgia"/>
+          <w:color w:val="222222"/>
+          <w:sz w:val="20"/>
+        </w:rPr>
+        <w:t xml:space="preserve">   Guiding Bolt, Healing Word, Goodberry, Faerie Fire, Speak with Animals, Animal Friendship</w:t>
+      </w:r>
+    </w:p>
+    <w:p>
+      <w:pPr>
+        <w:keepNext/>
+        <w:pBdr>
+          <w:left w:val="single" w:sz="18" w:space="12" w:color="5B2A86"/>
+        </w:pBdr>
+        <w:shd w:val="clear" w:color="auto" w:fill="FBF6EA"/>
+        <w:spacing w:before="0" w:after="40"/>
+        <w:ind w:left="340" w:right="340"/>
+      </w:pPr>
+      <w:r>
+        <w:rPr>
+          <w:rFonts w:ascii="Georgia" w:hAnsi="Georgia" w:cs="Georgia"/>
+          <w:b/>
+          <w:color w:val="5B2A86"/>
+          <w:sz w:val="22"/>
+        </w:rPr>
+        <w:t xml:space="preserve">2nd  </w:t>
+      </w:r>
+      <w:r>
+        <w:rPr>
+          <w:rFonts w:ascii="Georgia" w:hAnsi="Georgia" w:cs="Georgia"/>
+          <w:b/>
+          <w:color w:val="5B2A86"/>
+          <w:sz w:val="25"/>
+        </w:rPr>
+        <w:t xml:space="preserve">☐ ☐ ☐ </w:t>
+      </w:r>
+      <w:r>
+        <w:rPr>
+          <w:rFonts w:ascii="Georgia" w:hAnsi="Georgia" w:cs="Georgia"/>
+          <w:color w:val="222222"/>
+          <w:sz w:val="20"/>
+        </w:rPr>
+        <w:t xml:space="preserve">   Moonbeam, Flaming Sphere, Spike Growth, Summon Beast</w:t>
+      </w:r>
+    </w:p>
+    <w:p>
+      <w:pPr>
+        <w:keepNext w:val="0"/>
+        <w:pBdr>
+          <w:left w:val="single" w:sz="18" w:space="12" w:color="5B2A86"/>
+        </w:pBdr>
+        <w:shd w:val="clear" w:color="auto" w:fill="FBF6EA"/>
+        <w:spacing w:before="0" w:after="160"/>
+        <w:ind w:left="340" w:right="340"/>
+      </w:pPr>
+      <w:r>
+        <w:rPr>
+          <w:rFonts w:ascii="Georgia" w:hAnsi="Georgia" w:cs="Georgia"/>
+          <w:b/>
+          <w:color w:val="5B2A86"/>
+          <w:sz w:val="22"/>
+        </w:rPr>
+        <w:t xml:space="preserve">3rd  </w:t>
+      </w:r>
+      <w:r>
+        <w:rPr>
+          <w:rFonts w:ascii="Georgia" w:hAnsi="Georgia" w:cs="Georgia"/>
+          <w:b/>
+          <w:color w:val="5B2A86"/>
+          <w:sz w:val="25"/>
+        </w:rPr>
+        <w:t xml:space="preserve">☐ ☐ </w:t>
+      </w:r>
+      <w:r>
+        <w:rPr>
+          <w:rFonts w:ascii="Georgia" w:hAnsi="Georgia" w:cs="Georgia"/>
+          <w:color w:val="222222"/>
+          <w:sz w:val="20"/>
+        </w:rPr>
+        <w:t xml:space="preserve">   Call Lightning, Summon Fey</w:t>
+      </w:r>
+    </w:p>
+    <w:p>
+      <w:pPr>
+        <w:keepNext/>
         <w:spacing w:before="220" w:after="60"/>
       </w:pPr>
       <w:r>
@@ -5185,7 +5502,7 @@
           <w:color w:val="222222"/>
           <w:sz w:val="18"/>
         </w:rPr>
-        <w:t xml:space="preserve"> Bonus action, self, 1 minute. Starlight sheathes his staff: for 1 minute it swings with WISDOM, +9 to hit (+10 in Starry Form), 1d10 + 6 force or bludgeoning, his choice. Recast any time. His answer when something gets right in his face. (House rule: replaces Primal Savagery, 2024 rules.)</w:t>
+        <w:t xml:space="preserve"> Bonus action, self, 1 minute. Starlight sheathes his staff: for 1 minute it swings with WISDOM, +9 to hit, 1d10 + 6 force or bludgeoning, his choice. Recast any time. His answer when something gets right in his face. (House rule: replaces Primal Savagery, 2024 rules.)</w:t>
       </w:r>
     </w:p>
     <w:p>

</xml_diff>